<commit_message>
Update proposal document to FINAL v0
Co-Authored-By: Claude Sonnet 4.6 <noreply@anthropic.com>
</commit_message>
<xml_diff>
--- a/public/briefings/norfolk-ai-impact-board-proposal.docx
+++ b/public/briefings/norfolk-ai-impact-board-proposal.docx
@@ -1010,10 +1010,36 @@
       <w:pPr>
         <w:spacing w:after="0"/>
         <w:ind w:left="720"/>
+        <w:rPr>
+          <w:color w:val="0563C1"/>
+          <w:u w:val="single"/>
+        </w:rPr>
       </w:pPr>
-      <w:r>
-        <w:t>VentureBeat: What the OpenClaw moment means for enterprises: 5 big takeaways</w:t>
-      </w:r>
+      <w:hyperlink r:id="rId6" w:history="1">
+        <w:r>
+          <w:rPr>
+            <w:color w:val="0563C1"/>
+            <w:u w:val="single"/>
+          </w:rPr>
+          <w:t xml:space="preserve">VentureBeat: What the </w:t>
+        </w:r>
+        <w:proofErr w:type="spellStart"/>
+        <w:r>
+          <w:rPr>
+            <w:color w:val="0563C1"/>
+            <w:u w:val="single"/>
+          </w:rPr>
+          <w:t>OpenClaw</w:t>
+        </w:r>
+        <w:proofErr w:type="spellEnd"/>
+        <w:r>
+          <w:rPr>
+            <w:color w:val="0563C1"/>
+            <w:u w:val="single"/>
+          </w:rPr>
+          <w:t xml:space="preserve"> moment means for enterprises: 5 big takeaways</w:t>
+        </w:r>
+      </w:hyperlink>
     </w:p>
     <w:p>
       <w:pPr>
@@ -1035,7 +1061,7 @@
         <w:spacing w:after="0"/>
         <w:ind w:left="720"/>
       </w:pPr>
-      <w:hyperlink r:id="rId6">
+      <w:hyperlink r:id="rId7">
         <w:r>
           <w:rPr>
             <w:color w:val="0563C1"/>
@@ -1065,7 +1091,7 @@
         <w:spacing w:after="0"/>
         <w:ind w:left="720"/>
       </w:pPr>
-      <w:hyperlink r:id="rId7">
+      <w:hyperlink r:id="rId8">
         <w:r>
           <w:rPr>
             <w:color w:val="0563C1"/>
@@ -12677,6 +12703,29 @@
       </w:tcPr>
     </w:tblStylePr>
   </w:style>
+  <w:style w:type="character" w:styleId="Hyperlink">
+    <w:name w:val="Hyperlink"/>
+    <w:basedOn w:val="DefaultParagraphFont"/>
+    <w:uiPriority w:val="99"/>
+    <w:unhideWhenUsed/>
+    <w:rsid w:val="00194DD8"/>
+    <w:rPr>
+      <w:color w:val="0000FF" w:themeColor="hyperlink"/>
+      <w:u w:val="single"/>
+    </w:rPr>
+  </w:style>
+  <w:style w:type="character" w:styleId="UnresolvedMention">
+    <w:name w:val="Unresolved Mention"/>
+    <w:basedOn w:val="DefaultParagraphFont"/>
+    <w:uiPriority w:val="99"/>
+    <w:semiHidden/>
+    <w:unhideWhenUsed/>
+    <w:rsid w:val="00194DD8"/>
+    <w:rPr>
+      <w:color w:val="605E5C"/>
+      <w:shd w:val="clear" w:color="auto" w:fill="E1DFDD"/>
+    </w:rPr>
+  </w:style>
 </w:styles>
 </file>
 

</xml_diff>